<commit_message>
added an Incident Report form in WOrd format to be accessable from the wiki
</commit_message>
<xml_diff>
--- a/assets/documents/Incident_Report_Form.docx
+++ b/assets/documents/Incident_Report_Form.docx
@@ -9596,8 +9596,8 @@
 </file>
 
 <file path=customXml/item2.xml><?xml version="1.0" encoding="utf-8"?>
-<ct:contentTypeSchema xmlns:ct="http://schemas.microsoft.com/office/2006/metadata/contentType" xmlns:ma="http://schemas.microsoft.com/office/2006/metadata/properties/metaAttributes" ct:_="" ma:_="" ma:contentTypeName="Document" ma:contentTypeID="0x0101004FE47EDC821BDF48B4A02F50FA0D7AA2" ma:contentTypeVersion="18" ma:contentTypeDescription="Create a new document." ma:contentTypeScope="" ma:versionID="40aece0d8d99c3fc5e68d58a47d3b9b0">
-  <xsd:schema xmlns:xsd="http://www.w3.org/2001/XMLSchema" xmlns:xs="http://www.w3.org/2001/XMLSchema" xmlns:p="http://schemas.microsoft.com/office/2006/metadata/properties" xmlns:ns2="739bdb02-8359-4bf5-94bc-edd490470c6d" xmlns:ns3="766209d0-6631-4f1e-9a64-6298cbbf9a9c" targetNamespace="http://schemas.microsoft.com/office/2006/metadata/properties" ma:root="true" ma:fieldsID="9f246e5b0689f77cd362601be807b542" ns2:_="" ns3:_="">
+<ct:contentTypeSchema xmlns:ct="http://schemas.microsoft.com/office/2006/metadata/contentType" xmlns:ma="http://schemas.microsoft.com/office/2006/metadata/properties/metaAttributes" ct:_="" ma:_="" ma:contentTypeName="Document" ma:contentTypeID="0x0101004FE47EDC821BDF48B4A02F50FA0D7AA2" ma:contentTypeVersion="18" ma:contentTypeDescription="Create a new document." ma:contentTypeScope="" ma:versionID="2fd3e4d2d024bb689064f6057e5821be">
+  <xsd:schema xmlns:xsd="http://www.w3.org/2001/XMLSchema" xmlns:xs="http://www.w3.org/2001/XMLSchema" xmlns:p="http://schemas.microsoft.com/office/2006/metadata/properties" xmlns:ns2="739bdb02-8359-4bf5-94bc-edd490470c6d" xmlns:ns3="766209d0-6631-4f1e-9a64-6298cbbf9a9c" targetNamespace="http://schemas.microsoft.com/office/2006/metadata/properties" ma:root="true" ma:fieldsID="c14d6fcbd9e298432268f662a4321ce1" ns2:_="" ns3:_="">
     <xsd:import namespace="739bdb02-8359-4bf5-94bc-edd490470c6d"/>
     <xsd:import namespace="766209d0-6631-4f1e-9a64-6298cbbf9a9c"/>
     <xsd:element name="properties">
@@ -9870,22 +9870,7 @@
 </file>
 
 <file path=customXml/itemProps2.xml><?xml version="1.0" encoding="utf-8"?>
-<ds:datastoreItem xmlns:ds="http://schemas.openxmlformats.org/officeDocument/2006/customXml" ds:itemID="{155DEA5A-5DD0-4C3A-A87D-632D968D52AC}">
-  <ds:schemaRefs>
-    <ds:schemaRef ds:uri="http://schemas.microsoft.com/office/2006/metadata/contentType"/>
-    <ds:schemaRef ds:uri="http://schemas.microsoft.com/office/2006/metadata/properties/metaAttributes"/>
-    <ds:schemaRef ds:uri="http://www.w3.org/2001/XMLSchema"/>
-    <ds:schemaRef ds:uri="http://schemas.microsoft.com/office/2006/metadata/properties"/>
-    <ds:schemaRef ds:uri="739bdb02-8359-4bf5-94bc-edd490470c6d"/>
-    <ds:schemaRef ds:uri="766209d0-6631-4f1e-9a64-6298cbbf9a9c"/>
-    <ds:schemaRef ds:uri="http://schemas.microsoft.com/office/2006/documentManagement/types"/>
-    <ds:schemaRef ds:uri="http://schemas.microsoft.com/office/infopath/2007/PartnerControls"/>
-    <ds:schemaRef ds:uri="http://schemas.openxmlformats.org/package/2006/metadata/core-properties"/>
-    <ds:schemaRef ds:uri="http://purl.org/dc/elements/1.1/"/>
-    <ds:schemaRef ds:uri="http://purl.org/dc/terms/"/>
-    <ds:schemaRef ds:uri="http://schemas.microsoft.com/internal/obd"/>
-  </ds:schemaRefs>
-</ds:datastoreItem>
+<ds:datastoreItem xmlns:ds="http://schemas.openxmlformats.org/officeDocument/2006/customXml" ds:itemID="{72DB914F-A24A-4481-A666-43C57EDC5E73}"/>
 </file>
 
 <file path=customXml/itemProps3.xml><?xml version="1.0" encoding="utf-8"?>

</xml_diff>